<commit_message>
HR Create EOM: run on the 15th instead of the 25th
Two weeks' lead means no class fetch — a week straddling month end, or one run
early by hand — can reach a month whose EOM doesn't exist yet.

Co-Authored-By: Claude Opus 5 <noreply@anthropic.com>
</commit_message>
<xml_diff>
--- a/docs/HR_Create_EOM_Documentation.docx
+++ b/docs/HR_Create_EOM_Documentation.docx
@@ -33,7 +33,7 @@
     </w:p>
     <w:p>
       <w:r>
-        <w:t xml:space="preserve">Keeps one EOM (End of Month) record per calendar month, so instructor classes can be assigned to the month they fall in and the month-level payroll checks have somewhere to live. On the 25th it creates next month: Start = the 1st, End = the last day.</w:t>
+        <w:t xml:space="preserve">Keeps one EOM (End of Month) record per calendar month, so instructor classes can be assigned to the month they fall in and the month-level payroll checks have somewhere to live. On the 15th it creates next month: Start = the 1st, End = the last day.</w:t>
       </w:r>
     </w:p>
     <w:p>
@@ -46,7 +46,7 @@
     </w:p>
     <w:p>
       <w:r>
-        <w:t xml:space="preserve">- Runs on the 25th of each month; can also be run by hand.</w:t>
+        <w:t xml:space="preserve">- Runs on the 15th of each month; can also be run by hand.</w:t>
       </w:r>
     </w:p>
     <w:p>
@@ -74,12 +74,12 @@
         <w:pStyle w:val="Heading2"/>
       </w:pPr>
       <w:r>
-        <w:t xml:space="preserve">3. Why the 25th</w:t>
-      </w:r>
-    </w:p>
-    <w:p>
-      <w:r>
-        <w:t xml:space="preserve">The month is created about a week before it starts, so the Airtable sync into HR - Instructors has time to carry it over before any class in that month is imported. The instructor class sync refuses to import a class whose month has no EOM, so this lead time is what keeps the weekly class run working across a month boundary.</w:t>
+        <w:t xml:space="preserve">3. Why the 15th</w:t>
+      </w:r>
+    </w:p>
+    <w:p>
+      <w:r>
+        <w:t xml:space="preserve">The instructor class sync refuses to import a class whose month has no EOM, so next month must exist before any fetch can reach it. The job originally ran on the 25th; that left little margin for a week straddling month end fetched early by hand (February weeks can start before the 25th and end in March) or for a failed run. It was moved to the 15th on 2026-09-17, giving about two weeks for the job and the Airtable sync into HR - Instructors.</w:t>
       </w:r>
     </w:p>
     <w:p>
@@ -146,7 +146,7 @@
     </w:p>
     <w:p>
       <w:r>
-        <w:t xml:space="preserve">.github/workflows/hr-create-eom.yml. Triggers: schedule 0 8 25 * * (08:00 UTC = 4am EDT / 3am EST) and workflow_dispatch. Steps: checkout, Node 20, run the script. The job is idempotent, so running it by hand any day is safe; it only ever creates months that are missing.</w:t>
+        <w:t xml:space="preserve">.github/workflows/hr-create-eom.yml. Triggers: schedule 0 8 15 * * (08:00 UTC = 4am EDT / 3am EST) and workflow_dispatch. Steps: checkout, Node 20, run the script. The job is idempotent, so running it by hand any day is safe; it only ever creates months that are missing.</w:t>
       </w:r>
     </w:p>
     <w:p>
@@ -246,7 +246,7 @@
     </w:p>
     <w:p>
       <w:r>
-        <w:t xml:space="preserve">2026-09-17: offline tests 9 of 9 passed — September 25 gives October 1-31, December rolls to January of the next year, February gives 28 days and 29 in a leap year, a 30-day month, no-op when next month exists, October 25 creates only November, a missed run backfills November-January in order, and an empty table creates only next month. A live manual run on 2026-09-17 correctly reported nothing to do because October already existed. EOM rows for August, September and October 2026 exist; after the backfill their checks read: August No Instructor/No Emp ID 4, September 1, everything else ALL GOOD, Date Range ALL GOOD.</w:t>
+        <w:t xml:space="preserve">2026-09-17: offline tests 9 of 9 passed (re-run for the 15th schedule) — September 15 gives October 1-31, December rolls to January of the next year, February gives 28 days and 29 in a leap year, a 30-day month, no-op when next month exists, October 15 creates only November, a missed run backfills November-January in order, and an empty table creates only next month. A live manual run on 2026-09-17 correctly reported nothing to do because October already existed. EOM rows for August, September and October 2026 exist; after the backfill their checks read: August No Instructor/No Emp ID 4, September 1, everything else ALL GOOD, Date Range ALL GOOD.</w:t>
       </w:r>
     </w:p>
     <w:p>

</xml_diff>